<commit_message>
Grafiken durchgehend gN-nummeriert, Gesamtquote-Berechnung dokumentiert, IQTIG-PDF ignoriert
Grafiken auf einheitliches g1-g13-Namensschema umgestellt (u. a. Decision-Tree-
Grafiken, Bundesland-Kachelkarte, Fortbildungsquote als eigene Grafik ausgegliedert),
Doku (Workflow.md, ProjektDetails.md, 02_Analyse.md, 03_Decision_Tree.md,
Fragen_und_Antworten.md, Qualitätsindikator.md) und Notebooks entsprechend
aktualisiert. 02_Analyse.md/.ipynb um die indikator- vs. hausgewichtete
Gesamtquote (7,71 % / 8,62 %) ergänzt, inkl. neuer Berechnungs-Zelle im
Notebook. 01_Exploration_Ref als Referenzdokument für den Python/Power-BI-
Konkordanzvergleich ergänzt. g1_auffaellig_quote.png: Bin-Breiten-Bug behoben.
Zweite externe IQTIG-Quell-PDF (25,5 MB) analog zur bestehenden ignoriert.

Co-Authored-By: Claude Sonnet 5 <noreply@anthropic.com>
</commit_message>
<xml_diff>
--- a/Doku/Dozent/Fortschrittsbericht_Qualitaets_Muster_Finder.docx
+++ b/Doku/Dozent/Fortschrittsbericht_Qualitaets_Muster_Finder.docx
@@ -38,7 +38,7 @@
           <w:color w:val="555555"/>
           <w:sz w:val="22"/>
         </w:rPr>
-        <w:t>Datenanalyse-Projekt · 18.08.2026</w:t>
+        <w:t>Datenanalyse-Projekt · 20.08.2026</w:t>
         <w:br/>
         <w:t>Datenbasis: IQTIG Qualitätsberichte 2023 · 1.821 Krankenhäuser</w:t>
       </w:r>
@@ -3343,7 +3343,7 @@
           <w:i w:val="0"/>
           <w:sz w:val="22"/>
         </w:rPr>
-        <w:t>Notebook: Notebooks/02_Analyse.ipynb  ·  Ergebnis: 12 Grafiken in grafiken/  ·  5 statistische Tests</w:t>
+        <w:t>Notebook: Notebooks/02_Analyse.ipynb  ·  Ergebnis: 10 Grafiken in grafiken/  ·  5 statistische Tests</w:t>
       </w:r>
     </w:p>
     <w:p>
@@ -3365,7 +3365,7 @@
           <w:color w:val="BF5A00"/>
           <w:sz w:val="24"/>
         </w:rPr>
-        <w:t>3.1  Die 12 Grafiken im Detail</w:t>
+        <w:t>3.1  Die 10 Grafiken im Detail</w:t>
       </w:r>
     </w:p>
     <w:p>
@@ -4038,7 +4038,7 @@
           <w:color w:val="555555"/>
           <w:sz w:val="20"/>
         </w:rPr>
-        <w:t>Grafik 5+6 — Fortbildungsquote (kein Unterschied) &amp; Ärzte pro Bett (sichtbarer Unterschied)</w:t>
+        <w:t>Grafik 5+6 — Ärzte pro Bett &amp; Pflegekräfte pro Bett (beide mit sichtbarem Unterschied)</w:t>
       </w:r>
     </w:p>
     <w:p>
@@ -4049,7 +4049,7 @@
       <w:r>
         <w:drawing>
           <wp:inline xmlns:a="http://schemas.openxmlformats.org/drawingml/2006/main" xmlns:pic="http://schemas.openxmlformats.org/drawingml/2006/picture">
-            <wp:extent cx="4680000" cy="2076773"/>
+            <wp:extent cx="4680000" cy="2073555"/>
             <wp:docPr id="6" name="Picture 6"/>
             <wp:cNvGraphicFramePr>
               <a:graphicFrameLocks noChangeAspect="1"/>
@@ -4058,7 +4058,7 @@
               <a:graphicData uri="http://schemas.openxmlformats.org/drawingml/2006/picture">
                 <pic:pic>
                   <pic:nvPicPr>
-                    <pic:cNvPr id="0" name="g5_6_fortbildung_aerzte.png"/>
+                    <pic:cNvPr id="0" name="g5_6_aerzte_pflege.png"/>
                     <pic:cNvPicPr/>
                   </pic:nvPicPr>
                   <pic:blipFill>
@@ -4070,7 +4070,7 @@
                   <pic:spPr>
                     <a:xfrm>
                       <a:off x="0" y="0"/>
-                      <a:ext cx="4680000" cy="2076773"/>
+                      <a:ext cx="4680000" cy="2073555"/>
                     </a:xfrm>
                     <a:prstGeom prst="rect"/>
                   </pic:spPr>
@@ -4097,7 +4097,7 @@
           <w:color w:val="555555"/>
           <w:sz w:val="19"/>
         </w:rPr>
-        <w:t>Warum wichtig: Die entscheidende Weiche der gesamten Analyse. Fortbildungsquote zeigt keinerlei Unterschied (Md=0,667 in beiden Gruppen) und wird verworfen. Ärzte pro Bett zeigt eine sichtbare Verschiebung (Md 0,382 vs. 0,470, Häuser mit vielen Problemen haben MEHR Ärzte pro Bett) — bestätigt sich später per T-Test (t=−9,13, p&lt;0,0001) als stärkstes Einzelmerkmal und höchste Feature Importance im späteren Decision Tree.</w:t>
+        <w:t>Warum wichtig: Die entscheidende Weiche der gesamten Analyse — beide Personal-Merkmale zeigen dieselbe Richtung. Ärzte pro Bett: Md 0,382 vs. 0,470 (Häuser mit vielen Problemen haben MEHR Ärzte pro Bett) — bestätigt sich später per T-Test (t=−9,13, p&lt;0,0001) als stärkstes Einzelmerkmal und höchste Feature Importance im späteren Decision Tree. Pflegekräfte pro Bett: Md 0,891 vs. 1,047, dasselbe Muster, ebenfalls hoch signifikant (t=−7,51, p&lt;0,0001) — ein Hinweis, dass beide Merkmale teilweise dieselbe Eigenschaft 'Personalausstattung' messen (Korrelation r=0,58 untereinander, siehe Grafik 8).</w:t>
       </w:r>
     </w:p>
     <w:p>
@@ -4122,7 +4122,7 @@
       <w:r>
         <w:drawing>
           <wp:inline xmlns:a="http://schemas.openxmlformats.org/drawingml/2006/main" xmlns:pic="http://schemas.openxmlformats.org/drawingml/2006/picture">
-            <wp:extent cx="4680000" cy="2882384"/>
+            <wp:extent cx="2880000" cy="4133770"/>
             <wp:docPr id="7" name="Picture 7"/>
             <wp:cNvGraphicFramePr>
               <a:graphicFrameLocks noChangeAspect="1"/>
@@ -4131,7 +4131,7 @@
               <a:graphicData uri="http://schemas.openxmlformats.org/drawingml/2006/picture">
                 <pic:pic>
                   <pic:nvPicPr>
-                    <pic:cNvPr id="0" name="g7_bundesland.png"/>
+                    <pic:cNvPr id="0" name="g7_bundesland_kachelkarte.png"/>
                     <pic:cNvPicPr/>
                   </pic:nvPicPr>
                   <pic:blipFill>
@@ -4143,7 +4143,7 @@
                   <pic:spPr>
                     <a:xfrm>
                       <a:off x="0" y="0"/>
-                      <a:ext cx="4680000" cy="2882384"/>
+                      <a:ext cx="2880000" cy="4133770"/>
                     </a:xfrm>
                     <a:prstGeom prst="rect"/>
                   </pic:spPr>
@@ -4257,7 +4257,7 @@
           <w:color w:val="555555"/>
           <w:sz w:val="20"/>
         </w:rPr>
-        <w:t>Grafik 9 — Streudiagramm: Bettenzahl vs. Ärzte pro Bett</w:t>
+        <w:t>Grafik 9 — Konzernhaus (52,5 %) vs. unabhängiges Haus (49,0 %)</w:t>
       </w:r>
     </w:p>
     <w:p>
@@ -4268,7 +4268,7 @@
       <w:r>
         <w:drawing>
           <wp:inline xmlns:a="http://schemas.openxmlformats.org/drawingml/2006/main" xmlns:pic="http://schemas.openxmlformats.org/drawingml/2006/picture">
-            <wp:extent cx="4680000" cy="3178547"/>
+            <wp:extent cx="4680000" cy="3414619"/>
             <wp:docPr id="9" name="Picture 9"/>
             <wp:cNvGraphicFramePr>
               <a:graphicFrameLocks noChangeAspect="1"/>
@@ -4277,230 +4277,11 @@
               <a:graphicData uri="http://schemas.openxmlformats.org/drawingml/2006/picture">
                 <pic:pic>
                   <pic:nvPicPr>
-                    <pic:cNvPr id="0" name="g9_scatter_betten_aerzte.png"/>
+                    <pic:cNvPr id="0" name="g9_konzern_vergleich.png"/>
                     <pic:cNvPicPr/>
                   </pic:nvPicPr>
                   <pic:blipFill>
                     <a:blip r:embed="rId16"/>
-                    <a:stretch>
-                      <a:fillRect/>
-                    </a:stretch>
-                  </pic:blipFill>
-                  <pic:spPr>
-                    <a:xfrm>
-                      <a:off x="0" y="0"/>
-                      <a:ext cx="4680000" cy="3178547"/>
-                    </a:xfrm>
-                    <a:prstGeom prst="rect"/>
-                  </pic:spPr>
-                </pic:pic>
-              </a:graphicData>
-            </a:graphic>
-          </wp:inline>
-        </w:drawing>
-      </w:r>
-    </w:p>
-    <w:p>
-      <w:pPr>
-        <w:spacing w:after="40"/>
-      </w:pPr>
-    </w:p>
-    <w:p>
-      <w:pPr>
-        <w:spacing w:before="0" w:after="100"/>
-      </w:pPr>
-      <w:r>
-        <w:rPr>
-          <w:b w:val="0"/>
-          <w:i w:val="0"/>
-          <w:color w:val="555555"/>
-          <w:sz w:val="19"/>
-        </w:rPr>
-        <w:t>Warum wichtig: Prüft, ob sich die beiden Gruppen anhand von zwei Merkmalen gemeinsam trennen lassen — mehr Information als eine einzelne Korrelationszahl. Starke Überlappung bestätigt: Mit diesen beiden Merkmalen allein lässt sich kein Haus zuverlässig zuordnen.</w:t>
-      </w:r>
-    </w:p>
-    <w:p>
-      <w:pPr>
-        <w:keepNext/>
-        <w:spacing w:before="120"/>
-      </w:pPr>
-      <w:r>
-        <w:rPr>
-          <w:b/>
-          <w:color w:val="555555"/>
-          <w:sz w:val="20"/>
-        </w:rPr>
-        <w:t>Grafik 10 — Störfaktor: Private Häuser (Md 125 Betten) deutlich kleiner als öffentliche (232)</w:t>
-      </w:r>
-    </w:p>
-    <w:p>
-      <w:pPr>
-        <w:keepNext/>
-        <w:keepLines/>
-      </w:pPr>
-      <w:r>
-        <w:drawing>
-          <wp:inline xmlns:a="http://schemas.openxmlformats.org/drawingml/2006/main" xmlns:pic="http://schemas.openxmlformats.org/drawingml/2006/picture">
-            <wp:extent cx="4680000" cy="3155754"/>
-            <wp:docPr id="10" name="Picture 10"/>
-            <wp:cNvGraphicFramePr>
-              <a:graphicFrameLocks noChangeAspect="1"/>
-            </wp:cNvGraphicFramePr>
-            <a:graphic>
-              <a:graphicData uri="http://schemas.openxmlformats.org/drawingml/2006/picture">
-                <pic:pic>
-                  <pic:nvPicPr>
-                    <pic:cNvPr id="0" name="g10_stoerfaktor_traeger.png"/>
-                    <pic:cNvPicPr/>
-                  </pic:nvPicPr>
-                  <pic:blipFill>
-                    <a:blip r:embed="rId17"/>
-                    <a:stretch>
-                      <a:fillRect/>
-                    </a:stretch>
-                  </pic:blipFill>
-                  <pic:spPr>
-                    <a:xfrm>
-                      <a:off x="0" y="0"/>
-                      <a:ext cx="4680000" cy="3155754"/>
-                    </a:xfrm>
-                    <a:prstGeom prst="rect"/>
-                  </pic:spPr>
-                </pic:pic>
-              </a:graphicData>
-            </a:graphic>
-          </wp:inline>
-        </w:drawing>
-      </w:r>
-    </w:p>
-    <w:p>
-      <w:pPr>
-        <w:spacing w:after="40"/>
-      </w:pPr>
-    </w:p>
-    <w:p>
-      <w:pPr>
-        <w:spacing w:before="0" w:after="100"/>
-      </w:pPr>
-      <w:r>
-        <w:rPr>
-          <w:b w:val="0"/>
-          <w:i w:val="0"/>
-          <w:color w:val="555555"/>
-          <w:sz w:val="19"/>
-        </w:rPr>
-        <w:t>Warum wichtig: Ein methodisch relevanter Kontroll-Befund, jetzt aber zweitrangig: Da die ANOVA in Grafik 3 schon auf Ebene der stetigen Quote keinen Trägereffekt findet, muss hier auch nichts mehr bereinigt werden. Zeigt aber weiterhin, wie wichtig es war, diesen Störfaktor überhaupt zu prüfen, bevor man aus Grafik 3 vorschnell 'privat = schlechter' geschlossen hätte.</w:t>
-      </w:r>
-    </w:p>
-    <w:p>
-      <w:pPr>
-        <w:keepNext/>
-        <w:spacing w:before="120"/>
-      </w:pPr>
-      <w:r>
-        <w:rPr>
-          <w:b/>
-          <w:color w:val="555555"/>
-          <w:sz w:val="20"/>
-        </w:rPr>
-        <w:t>Grafik 11 — Pflegekräfte pro Bett: Wenige Probleme Md=0,891, Viele Probleme Md=1,047</w:t>
-      </w:r>
-    </w:p>
-    <w:p>
-      <w:pPr>
-        <w:keepNext/>
-        <w:keepLines/>
-      </w:pPr>
-      <w:r>
-        <w:drawing>
-          <wp:inline xmlns:a="http://schemas.openxmlformats.org/drawingml/2006/main" xmlns:pic="http://schemas.openxmlformats.org/drawingml/2006/picture">
-            <wp:extent cx="4680000" cy="3049951"/>
-            <wp:docPr id="11" name="Picture 11"/>
-            <wp:cNvGraphicFramePr>
-              <a:graphicFrameLocks noChangeAspect="1"/>
-            </wp:cNvGraphicFramePr>
-            <a:graphic>
-              <a:graphicData uri="http://schemas.openxmlformats.org/drawingml/2006/picture">
-                <pic:pic>
-                  <pic:nvPicPr>
-                    <pic:cNvPr id="0" name="g11_pflege_pro_bett.png"/>
-                    <pic:cNvPicPr/>
-                  </pic:nvPicPr>
-                  <pic:blipFill>
-                    <a:blip r:embed="rId18"/>
-                    <a:stretch>
-                      <a:fillRect/>
-                    </a:stretch>
-                  </pic:blipFill>
-                  <pic:spPr>
-                    <a:xfrm>
-                      <a:off x="0" y="0"/>
-                      <a:ext cx="4680000" cy="3049951"/>
-                    </a:xfrm>
-                    <a:prstGeom prst="rect"/>
-                  </pic:spPr>
-                </pic:pic>
-              </a:graphicData>
-            </a:graphic>
-          </wp:inline>
-        </w:drawing>
-      </w:r>
-    </w:p>
-    <w:p>
-      <w:pPr>
-        <w:spacing w:after="40"/>
-      </w:pPr>
-    </w:p>
-    <w:p>
-      <w:pPr>
-        <w:spacing w:before="0" w:after="100"/>
-      </w:pPr>
-      <w:r>
-        <w:rPr>
-          <w:b w:val="0"/>
-          <w:i w:val="0"/>
-          <w:color w:val="555555"/>
-          <w:sz w:val="19"/>
-        </w:rPr>
-        <w:t>Warum wichtig: Zeigt dasselbe (jetzt positive) Muster wie Ärzte pro Bett und bestätigt sich später ebenfalls per T-Test (t=−7,51, p&lt;0,0001) — wird zum drittwichtigsten Merkmal im Decision Tree. Die Ähnlichkeit zu Grafik 6 ist zugleich ein Hinweis auf Multikollinearität (beide Merkmale korrelieren auch untereinander, r=0,58).</w:t>
-      </w:r>
-    </w:p>
-    <w:p>
-      <w:pPr>
-        <w:keepNext/>
-        <w:spacing w:before="120"/>
-      </w:pPr>
-      <w:r>
-        <w:rPr>
-          <w:b/>
-          <w:color w:val="555555"/>
-          <w:sz w:val="20"/>
-        </w:rPr>
-        <w:t>Grafik 12 — Konzernhaus (52,5 %) vs. unabhängiges Haus (49,0 %)</w:t>
-      </w:r>
-    </w:p>
-    <w:p>
-      <w:pPr>
-        <w:keepNext/>
-        <w:keepLines/>
-      </w:pPr>
-      <w:r>
-        <w:drawing>
-          <wp:inline xmlns:a="http://schemas.openxmlformats.org/drawingml/2006/main" xmlns:pic="http://schemas.openxmlformats.org/drawingml/2006/picture">
-            <wp:extent cx="4680000" cy="3414619"/>
-            <wp:docPr id="12" name="Picture 12"/>
-            <wp:cNvGraphicFramePr>
-              <a:graphicFrameLocks noChangeAspect="1"/>
-            </wp:cNvGraphicFramePr>
-            <a:graphic>
-              <a:graphicData uri="http://schemas.openxmlformats.org/drawingml/2006/picture">
-                <pic:pic>
-                  <pic:nvPicPr>
-                    <pic:cNvPr id="0" name="g12_konzern_vergleich.png"/>
-                    <pic:cNvPicPr/>
-                  </pic:nvPicPr>
-                  <pic:blipFill>
-                    <a:blip r:embed="rId19"/>
                     <a:stretch>
                       <a:fillRect/>
                     </a:stretch>
@@ -4536,6 +4317,79 @@
           <w:sz w:val="19"/>
         </w:rPr>
         <w:t>Warum wichtig: Testet eine von Kollegen vorgeschlagene Hypothese (zentrale Qualitätssicherung im Konzern). Leicht unterschiedliche Werte, aber per Chi²-Test bestätigt: p=0,2585, klar nicht signifikant. Bewusst trotzdem im Modell belassen: 'Kein Zusammenhang' ist ein valider, dokumentierter Befund.</w:t>
+      </w:r>
+    </w:p>
+    <w:p>
+      <w:pPr>
+        <w:keepNext/>
+        <w:spacing w:before="120"/>
+      </w:pPr>
+      <w:r>
+        <w:rPr>
+          <w:b/>
+          <w:color w:val="555555"/>
+          <w:sz w:val="20"/>
+        </w:rPr>
+        <w:t>Grafik 10 — Fortbildungsquote: kein Unterschied zwischen den Gruppen</w:t>
+      </w:r>
+    </w:p>
+    <w:p>
+      <w:pPr>
+        <w:keepNext/>
+        <w:keepLines/>
+      </w:pPr>
+      <w:r>
+        <w:drawing>
+          <wp:inline xmlns:a="http://schemas.openxmlformats.org/drawingml/2006/main" xmlns:pic="http://schemas.openxmlformats.org/drawingml/2006/picture">
+            <wp:extent cx="4680000" cy="3437975"/>
+            <wp:docPr id="10" name="Picture 10"/>
+            <wp:cNvGraphicFramePr>
+              <a:graphicFrameLocks noChangeAspect="1"/>
+            </wp:cNvGraphicFramePr>
+            <a:graphic>
+              <a:graphicData uri="http://schemas.openxmlformats.org/drawingml/2006/picture">
+                <pic:pic>
+                  <pic:nvPicPr>
+                    <pic:cNvPr id="0" name="g10_fortbildungsquote.png"/>
+                    <pic:cNvPicPr/>
+                  </pic:nvPicPr>
+                  <pic:blipFill>
+                    <a:blip r:embed="rId17"/>
+                    <a:stretch>
+                      <a:fillRect/>
+                    </a:stretch>
+                  </pic:blipFill>
+                  <pic:spPr>
+                    <a:xfrm>
+                      <a:off x="0" y="0"/>
+                      <a:ext cx="4680000" cy="3437975"/>
+                    </a:xfrm>
+                    <a:prstGeom prst="rect"/>
+                  </pic:spPr>
+                </pic:pic>
+              </a:graphicData>
+            </a:graphic>
+          </wp:inline>
+        </w:drawing>
+      </w:r>
+    </w:p>
+    <w:p>
+      <w:pPr>
+        <w:spacing w:after="40"/>
+      </w:pPr>
+    </w:p>
+    <w:p>
+      <w:pPr>
+        <w:spacing w:before="0" w:after="100"/>
+      </w:pPr>
+      <w:r>
+        <w:rPr>
+          <w:b w:val="0"/>
+          <w:i w:val="0"/>
+          <w:color w:val="555555"/>
+          <w:sz w:val="19"/>
+        </w:rPr>
+        <w:t>Warum wichtig: Anders als bei Ärzten und Pflegekräften zeigt die Fortbildungsquote keinerlei Unterschied (Md=0,667 in beiden Gruppen) — kein Zusammenhang mit Qualitätsproblemen erkennbar. Auch das ist ein valides, dokumentiertes Ergebnis.</w:t>
       </w:r>
     </w:p>
     <w:p>

</xml_diff>